<commit_message>
Site d'exercice déplacé vers le compte alexandra-guiderdoni
Nouvelle adresse des TP :
https://alexandra-guiderdoni.github.io/tp-fabrication-igpde-102846-ay11/
(dépôt alexandra-guiderdoni/tp-fabrication-igpde-102846-ay11).

- sources, documentation, Makefile et démo hors ligne pointés vers la
  nouvelle adresse ; fiche des liens, mémos et fiche technique v2
  régénérés ou corrigés
- adresses imprimées sans coupure trompeuse : pas de césure dans la
  fiche des liens et les mémos, retour à la ligne après « / » pour la
  démo dans la fiche technique
- mémos : chemins d'images relatifs, résolus à la génération ; ils
  pointaient vers l'ancien espace de travail et auraient disparu avec
  lui
- options d'origine des mémos rétablies (texte alternatif « République
  française - IGPDE », en-tête explicite)
- hook : chemins personnels absolus bloqués aussi dans les sources
  Markdown et le site
</commit_message>
<xml_diff>
--- a/IGPDE-102846-livrables-octobre-2026/Formateur/documents-administratifs-igpde/102846FiTechn-v2.docx
+++ b/IGPDE-102846-livrables-octobre-2026/Formateur/documents-administratifs-igpde/102846FiTechn-v2.docx
@@ -882,7 +882,7 @@
           <w:rPr>
             <w:rStyle w:val="Lienhypertexte"/>
           </w:rPr>
-          <w:t xml:space="preserve">https://alexmacapple.github.io/easy-check-igpde/</w:t>
+          <w:t xml:space="preserve">https://alexandra-guiderdoni.github.io/tp-fabrication-igpde-102846-ay11/</w:t>
         </w:r>
       </w:hyperlink>
     </w:p>
@@ -903,7 +903,9 @@
           <w:rPr>
             <w:rStyle w:val="Lienhypertexte"/>
           </w:rPr>
-          <w:t xml:space="preserve">https://alexmacapple.github.io/easy-check-igpde/demo-mauvaise-restitution-emojis.html</w:t>
+          <w:t xml:space="preserve">https://alexandra-guiderdoni.github.io/tp-fabrication-igpde-102846-ay11/</w:t>
+          <w:br/>
+          <w:t>demo-mauvaise-restitution-emojis.html</w:t>
         </w:r>
       </w:hyperlink>
     </w:p>
@@ -1030,7 +1032,7 @@
           <w:rPr>
             <w:rStyle w:val="Lienhypertexte"/>
           </w:rPr>
-          <w:t xml:space="preserve">https://alexmacapple.github.io/easy-check-igpde/</w:t>
+          <w:t xml:space="preserve">https://alexandra-guiderdoni.github.io/tp-fabrication-igpde-102846-ay11/</w:t>
         </w:r>
       </w:hyperlink>
     </w:p>
@@ -1051,7 +1053,9 @@
           <w:rPr>
             <w:rStyle w:val="Lienhypertexte"/>
           </w:rPr>
-          <w:t xml:space="preserve">https://alexmacapple.github.io/easy-check-igpde/demo-mauvaise-restitution-emojis.html</w:t>
+          <w:t xml:space="preserve">https://alexandra-guiderdoni.github.io/tp-fabrication-igpde-102846-ay11/</w:t>
+          <w:br/>
+          <w:t>demo-mauvaise-restitution-emojis.html</w:t>
         </w:r>
       </w:hyperlink>
     </w:p>
@@ -1255,7 +1259,7 @@
               <w:pStyle w:val="Compact"/>
             </w:pPr>
             <w:r>
-              <w:t xml:space="preserve">Accès indispensable pendant le module web. Domaine à autoriser : alexmacapple.github.io.</w:t>
+              <w:t xml:space="preserve">Accès indispensable pendant le module web. Domaine à autoriser : alexandra-guiderdoni.github.io.</w:t>
             </w:r>
           </w:p>
         </w:tc>
@@ -1305,7 +1309,7 @@
               <w:pStyle w:val="Compact"/>
             </w:pPr>
             <w:r>
-              <w:t xml:space="preserve">Même domaine que le site d’exercice (alexmacapple.github.io).</w:t>
+              <w:t xml:space="preserve">Même domaine que le site d’exercice (alexandra-guiderdoni.github.io).</w:t>
             </w:r>
           </w:p>
         </w:tc>

</xml_diff>